<commit_message>
aggiunta mutation testing tramite stryker.
</commit_message>
<xml_diff>
--- a/ESAME_SOFTWARE_TESTING.docx
+++ b/ESAME_SOFTWARE_TESTING.docx
@@ -212,6 +212,7 @@
       <w:r>
         <w:t xml:space="preserve"> La copertura di transizioni misurata sulla FSM (</w:t>
       </w:r>
+      <w:proofErr w:type="spellStart"/>
       <w:r>
         <w:rPr>
           <w:rStyle w:val="CodiceHTML"/>
@@ -219,6 +220,7 @@
         </w:rPr>
         <w:t>CoperturaFSMExtension</w:t>
       </w:r>
+      <w:proofErr w:type="spellEnd"/>
       <w:r>
         <w:t xml:space="preserve">, si veda il capitolo precedente) verifica che ogni arco del modello a stati sia stato esercitato da almeno un test superato. Questa misura opera però a livello di </w:t>
       </w:r>
@@ -247,7 +249,31 @@
         <w:t>code coverage</w:t>
       </w:r>
       <w:r>
-        <w:t xml:space="preserve"> reale sul server Node.js, usando Istanbul/nyc, l'equivalente per l'ecosistema Node di strumenti come JaCoCo in ambito Java (non applicabile qui poiché il codice server è JavaScript, non Java).</w:t>
+        <w:t xml:space="preserve"> reale sul server Node.js, usando Istanbul/</w:t>
+      </w:r>
+      <w:proofErr w:type="spellStart"/>
+      <w:r>
+        <w:t>nyc</w:t>
+      </w:r>
+      <w:proofErr w:type="spellEnd"/>
+      <w:r>
+        <w:t xml:space="preserve">, l'equivalente per l'ecosistema </w:t>
+      </w:r>
+      <w:proofErr w:type="spellStart"/>
+      <w:r>
+        <w:t>Node</w:t>
+      </w:r>
+      <w:proofErr w:type="spellEnd"/>
+      <w:r>
+        <w:t xml:space="preserve"> di strumenti come </w:t>
+      </w:r>
+      <w:proofErr w:type="spellStart"/>
+      <w:r>
+        <w:t>JaCoCo</w:t>
+      </w:r>
+      <w:proofErr w:type="spellEnd"/>
+      <w:r>
+        <w:t xml:space="preserve"> in ambito Java (non applicabile qui poiché il codice server è JavaScript, non Java).</w:t>
       </w:r>
     </w:p>
     <w:p>
@@ -337,18 +363,78 @@
       </w:r>
       <w:r>
         <w:br/>
-        <w:t xml:space="preserve">analisi statica : </w:t>
+        <w:t xml:space="preserve">analisi </w:t>
+      </w:r>
+      <w:proofErr w:type="gramStart"/>
+      <w:r>
+        <w:t>statica :</w:t>
+      </w:r>
+      <w:proofErr w:type="gramEnd"/>
+      <w:r>
+        <w:t xml:space="preserve"> </w:t>
       </w:r>
     </w:p>
     <w:p>
-      <w:r>
+      <w:pPr>
+        <w:rPr>
+          <w:lang w:val="en-US"/>
+        </w:rPr>
+      </w:pPr>
+      <w:proofErr w:type="spellStart"/>
+      <w:proofErr w:type="gramStart"/>
+      <w:r>
+        <w:rPr>
+          <w:lang w:val="en-US"/>
+        </w:rPr>
         <w:lastRenderedPageBreak/>
-        <w:t xml:space="preserve">comando : </w:t>
-      </w:r>
-      <w:r>
-        <w:t>npx eslint ServerCliente.js ServerGestore.js --format stylish</w:t>
-      </w:r>
-      <w:r>
+        <w:t>comando</w:t>
+      </w:r>
+      <w:proofErr w:type="spellEnd"/>
+      <w:r>
+        <w:rPr>
+          <w:lang w:val="en-US"/>
+        </w:rPr>
+        <w:t xml:space="preserve"> :</w:t>
+      </w:r>
+      <w:proofErr w:type="gramEnd"/>
+      <w:r>
+        <w:rPr>
+          <w:lang w:val="en-US"/>
+        </w:rPr>
+        <w:t xml:space="preserve"> </w:t>
+      </w:r>
+      <w:proofErr w:type="spellStart"/>
+      <w:r>
+        <w:rPr>
+          <w:lang w:val="en-US"/>
+        </w:rPr>
+        <w:t>npx</w:t>
+      </w:r>
+      <w:proofErr w:type="spellEnd"/>
+      <w:r>
+        <w:rPr>
+          <w:lang w:val="en-US"/>
+        </w:rPr>
+        <w:t xml:space="preserve"> </w:t>
+      </w:r>
+      <w:proofErr w:type="spellStart"/>
+      <w:r>
+        <w:rPr>
+          <w:lang w:val="en-US"/>
+        </w:rPr>
+        <w:t>eslint</w:t>
+      </w:r>
+      <w:proofErr w:type="spellEnd"/>
+      <w:r>
+        <w:rPr>
+          <w:lang w:val="en-US"/>
+        </w:rPr>
+        <w:t xml:space="preserve"> ServerCliente.js ServerGestore.js --format stylish</w:t>
+      </w:r>
+      <w:r>
+        <w:rPr>
+          <w:lang w:val="en-US"/>
+        </w:rPr>
         <w:br/>
       </w:r>
       <w:r>
@@ -377,6 +463,393 @@
                     <a:xfrm>
                       <a:off x="0" y="0"/>
                       <a:ext cx="6120130" cy="2132330"/>
+                    </a:xfrm>
+                    <a:prstGeom prst="rect">
+                      <a:avLst/>
+                    </a:prstGeom>
+                  </pic:spPr>
+                </pic:pic>
+              </a:graphicData>
+            </a:graphic>
+          </wp:inline>
+        </w:drawing>
+      </w:r>
+    </w:p>
+    <w:p>
+      <w:r>
+        <w:t xml:space="preserve">ANALISI CLIENT.HTML &amp; Gestore HTML: </w:t>
+      </w:r>
+    </w:p>
+    <w:p>
+      <w:pPr>
+        <w:spacing w:before="100" w:beforeAutospacing="1" w:after="100" w:afterAutospacing="1" w:line="240" w:lineRule="auto"/>
+        <w:outlineLvl w:val="2"/>
+        <w:rPr>
+          <w:rFonts w:ascii="Times New Roman" w:eastAsia="Times New Roman" w:hAnsi="Times New Roman" w:cs="Times New Roman"/>
+          <w:b/>
+          <w:bCs/>
+          <w:kern w:val="0"/>
+          <w:sz w:val="27"/>
+          <w:szCs w:val="27"/>
+          <w:lang w:eastAsia="it-IT"/>
+          <w14:ligatures w14:val="none"/>
+        </w:rPr>
+      </w:pPr>
+      <w:r>
+        <w:rPr>
+          <w:rFonts w:ascii="Times New Roman" w:eastAsia="Times New Roman" w:hAnsi="Times New Roman" w:cs="Times New Roman"/>
+          <w:b/>
+          <w:bCs/>
+          <w:kern w:val="0"/>
+          <w:sz w:val="27"/>
+          <w:szCs w:val="27"/>
+          <w:lang w:eastAsia="it-IT"/>
+          <w14:ligatures w14:val="none"/>
+        </w:rPr>
+        <w:t>Commento al risultato</w:t>
+      </w:r>
+    </w:p>
+    <w:p>
+      <w:pPr>
+        <w:spacing w:before="100" w:beforeAutospacing="1" w:after="100" w:afterAutospacing="1" w:line="240" w:lineRule="auto"/>
+        <w:rPr>
+          <w:rFonts w:ascii="Times New Roman" w:eastAsia="Times New Roman" w:hAnsi="Times New Roman" w:cs="Times New Roman"/>
+          <w:kern w:val="0"/>
+          <w:lang w:eastAsia="it-IT"/>
+          <w14:ligatures w14:val="none"/>
+        </w:rPr>
+      </w:pPr>
+      <w:r>
+        <w:rPr>
+          <w:rFonts w:ascii="Times New Roman" w:eastAsia="Times New Roman" w:hAnsi="Times New Roman" w:cs="Times New Roman"/>
+          <w:b/>
+          <w:bCs/>
+          <w:kern w:val="0"/>
+          <w:lang w:eastAsia="it-IT"/>
+          <w14:ligatures w14:val="none"/>
+        </w:rPr>
+        <w:t>Zero errori su entrambi i file</w:t>
+      </w:r>
+      <w:r>
+        <w:rPr>
+          <w:rFonts w:ascii="Times New Roman" w:eastAsia="Times New Roman" w:hAnsi="Times New Roman" w:cs="Times New Roman"/>
+          <w:kern w:val="0"/>
+          <w:lang w:eastAsia="it-IT"/>
+          <w14:ligatures w14:val="none"/>
+        </w:rPr>
+        <w:t xml:space="preserve"> — buona notizia, e non è un risultato vuoto: anche senza un file di configurazione personalizzato, </w:t>
+      </w:r>
+      <w:proofErr w:type="spellStart"/>
+      <w:r>
+        <w:rPr>
+          <w:rFonts w:ascii="Courier New" w:eastAsia="Times New Roman" w:hAnsi="Courier New" w:cs="Courier New"/>
+          <w:kern w:val="0"/>
+          <w:sz w:val="20"/>
+          <w:szCs w:val="20"/>
+          <w:lang w:eastAsia="it-IT"/>
+          <w14:ligatures w14:val="none"/>
+        </w:rPr>
+        <w:t>htmlhint</w:t>
+      </w:r>
+      <w:proofErr w:type="spellEnd"/>
+      <w:r>
+        <w:rPr>
+          <w:rFonts w:ascii="Times New Roman" w:eastAsia="Times New Roman" w:hAnsi="Times New Roman" w:cs="Times New Roman"/>
+          <w:kern w:val="0"/>
+          <w:lang w:eastAsia="it-IT"/>
+          <w14:ligatures w14:val="none"/>
+        </w:rPr>
+        <w:t xml:space="preserve"> applica di default un set di regole abbastanza sensato (tag chiusi correttamente, </w:t>
+      </w:r>
+      <w:r>
+        <w:rPr>
+          <w:rFonts w:ascii="Courier New" w:eastAsia="Times New Roman" w:hAnsi="Courier New" w:cs="Courier New"/>
+          <w:kern w:val="0"/>
+          <w:sz w:val="20"/>
+          <w:szCs w:val="20"/>
+          <w:lang w:eastAsia="it-IT"/>
+          <w14:ligatures w14:val="none"/>
+        </w:rPr>
+        <w:t>id</w:t>
+      </w:r>
+      <w:r>
+        <w:rPr>
+          <w:rFonts w:ascii="Times New Roman" w:eastAsia="Times New Roman" w:hAnsi="Times New Roman" w:cs="Times New Roman"/>
+          <w:kern w:val="0"/>
+          <w:lang w:eastAsia="it-IT"/>
+          <w14:ligatures w14:val="none"/>
+        </w:rPr>
+        <w:t xml:space="preserve"> univoci nella pagina, attributi non duplicati, presenza del </w:t>
+      </w:r>
+      <w:proofErr w:type="spellStart"/>
+      <w:r>
+        <w:rPr>
+          <w:rFonts w:ascii="Times New Roman" w:eastAsia="Times New Roman" w:hAnsi="Times New Roman" w:cs="Times New Roman"/>
+          <w:kern w:val="0"/>
+          <w:lang w:eastAsia="it-IT"/>
+          <w14:ligatures w14:val="none"/>
+        </w:rPr>
+        <w:t>doctype</w:t>
+      </w:r>
+      <w:proofErr w:type="spellEnd"/>
+      <w:r>
+        <w:rPr>
+          <w:rFonts w:ascii="Times New Roman" w:eastAsia="Times New Roman" w:hAnsi="Times New Roman" w:cs="Times New Roman"/>
+          <w:kern w:val="0"/>
+          <w:lang w:eastAsia="it-IT"/>
+          <w14:ligatures w14:val="none"/>
+        </w:rPr>
+        <w:t xml:space="preserve">, ecc.). Il fatto che sia il </w:t>
+      </w:r>
+      <w:r>
+        <w:rPr>
+          <w:rFonts w:ascii="Courier New" w:eastAsia="Times New Roman" w:hAnsi="Courier New" w:cs="Courier New"/>
+          <w:kern w:val="0"/>
+          <w:sz w:val="20"/>
+          <w:szCs w:val="20"/>
+          <w:lang w:eastAsia="it-IT"/>
+          <w14:ligatures w14:val="none"/>
+        </w:rPr>
+        <w:t>Cliente.html</w:t>
+      </w:r>
+      <w:r>
+        <w:rPr>
+          <w:rFonts w:ascii="Times New Roman" w:eastAsia="Times New Roman" w:hAnsi="Times New Roman" w:cs="Times New Roman"/>
+          <w:kern w:val="0"/>
+          <w:lang w:eastAsia="it-IT"/>
+          <w14:ligatures w14:val="none"/>
+        </w:rPr>
+        <w:t xml:space="preserve"> che il </w:t>
+      </w:r>
+      <w:r>
+        <w:rPr>
+          <w:rFonts w:ascii="Courier New" w:eastAsia="Times New Roman" w:hAnsi="Courier New" w:cs="Courier New"/>
+          <w:kern w:val="0"/>
+          <w:sz w:val="20"/>
+          <w:szCs w:val="20"/>
+          <w:lang w:eastAsia="it-IT"/>
+          <w14:ligatures w14:val="none"/>
+        </w:rPr>
+        <w:t>Gestore.html</w:t>
+      </w:r>
+      <w:r>
+        <w:rPr>
+          <w:rFonts w:ascii="Times New Roman" w:eastAsia="Times New Roman" w:hAnsi="Times New Roman" w:cs="Times New Roman"/>
+          <w:kern w:val="0"/>
+          <w:lang w:eastAsia="it-IT"/>
+          <w14:ligatures w14:val="none"/>
+        </w:rPr>
+        <w:t xml:space="preserve"> lo passino puliti è una conferma concreta, non solo un'assenza di segnale — in particolare la regola sugli </w:t>
+      </w:r>
+      <w:r>
+        <w:rPr>
+          <w:rFonts w:ascii="Courier New" w:eastAsia="Times New Roman" w:hAnsi="Courier New" w:cs="Courier New"/>
+          <w:kern w:val="0"/>
+          <w:sz w:val="20"/>
+          <w:szCs w:val="20"/>
+          <w:lang w:eastAsia="it-IT"/>
+          <w14:ligatures w14:val="none"/>
+        </w:rPr>
+        <w:t>id</w:t>
+      </w:r>
+      <w:r>
+        <w:rPr>
+          <w:rFonts w:ascii="Times New Roman" w:eastAsia="Times New Roman" w:hAnsi="Times New Roman" w:cs="Times New Roman"/>
+          <w:kern w:val="0"/>
+          <w:lang w:eastAsia="it-IT"/>
+          <w14:ligatures w14:val="none"/>
+        </w:rPr>
+        <w:t xml:space="preserve"> univoci è rilevante per te: se avessi avuto due elementi con lo stesso </w:t>
+      </w:r>
+      <w:r>
+        <w:rPr>
+          <w:rFonts w:ascii="Courier New" w:eastAsia="Times New Roman" w:hAnsi="Courier New" w:cs="Courier New"/>
+          <w:kern w:val="0"/>
+          <w:sz w:val="20"/>
+          <w:szCs w:val="20"/>
+          <w:lang w:eastAsia="it-IT"/>
+          <w14:ligatures w14:val="none"/>
+        </w:rPr>
+        <w:t>id</w:t>
+      </w:r>
+      <w:r>
+        <w:rPr>
+          <w:rFonts w:ascii="Times New Roman" w:eastAsia="Times New Roman" w:hAnsi="Times New Roman" w:cs="Times New Roman"/>
+          <w:kern w:val="0"/>
+          <w:lang w:eastAsia="it-IT"/>
+          <w14:ligatures w14:val="none"/>
+        </w:rPr>
+        <w:t xml:space="preserve"> usato dai selettori </w:t>
+      </w:r>
+      <w:proofErr w:type="spellStart"/>
+      <w:r>
+        <w:rPr>
+          <w:rFonts w:ascii="Times New Roman" w:eastAsia="Times New Roman" w:hAnsi="Times New Roman" w:cs="Times New Roman"/>
+          <w:kern w:val="0"/>
+          <w:lang w:eastAsia="it-IT"/>
+          <w14:ligatures w14:val="none"/>
+        </w:rPr>
+        <w:t>Selenium</w:t>
+      </w:r>
+      <w:proofErr w:type="spellEnd"/>
+      <w:r>
+        <w:rPr>
+          <w:rFonts w:ascii="Times New Roman" w:eastAsia="Times New Roman" w:hAnsi="Times New Roman" w:cs="Times New Roman"/>
+          <w:kern w:val="0"/>
+          <w:lang w:eastAsia="it-IT"/>
+          <w14:ligatures w14:val="none"/>
+        </w:rPr>
+        <w:t xml:space="preserve"> (</w:t>
+      </w:r>
+      <w:r>
+        <w:rPr>
+          <w:rFonts w:ascii="Courier New" w:eastAsia="Times New Roman" w:hAnsi="Courier New" w:cs="Courier New"/>
+          <w:kern w:val="0"/>
+          <w:sz w:val="20"/>
+          <w:szCs w:val="20"/>
+          <w:lang w:eastAsia="it-IT"/>
+          <w14:ligatures w14:val="none"/>
+        </w:rPr>
+        <w:t>By.id(...)</w:t>
+      </w:r>
+      <w:r>
+        <w:rPr>
+          <w:rFonts w:ascii="Times New Roman" w:eastAsia="Times New Roman" w:hAnsi="Times New Roman" w:cs="Times New Roman"/>
+          <w:kern w:val="0"/>
+          <w:lang w:eastAsia="it-IT"/>
+          <w14:ligatures w14:val="none"/>
+        </w:rPr>
+        <w:t>), qui sarebbe emerso subito, invece che come bug intermittente scoperto a fatica durante i test.</w:t>
+      </w:r>
+    </w:p>
+    <w:p>
+      <w:pPr>
+        <w:spacing w:before="100" w:beforeAutospacing="1" w:after="100" w:afterAutospacing="1" w:line="240" w:lineRule="auto"/>
+        <w:rPr>
+          <w:rFonts w:ascii="Times New Roman" w:eastAsia="Times New Roman" w:hAnsi="Times New Roman" w:cs="Times New Roman"/>
+          <w:kern w:val="0"/>
+          <w:lang w:eastAsia="it-IT"/>
+          <w14:ligatures w14:val="none"/>
+        </w:rPr>
+      </w:pPr>
+      <w:r>
+        <w:rPr>
+          <w:rFonts w:ascii="Times New Roman" w:eastAsia="Times New Roman" w:hAnsi="Times New Roman" w:cs="Times New Roman"/>
+          <w:kern w:val="0"/>
+          <w:lang w:eastAsia="it-IT"/>
+          <w14:ligatures w14:val="none"/>
+        </w:rPr>
+        <w:t>Per la relazione:</w:t>
+      </w:r>
+    </w:p>
+    <w:p>
+      <w:pPr>
+        <w:spacing w:before="100" w:beforeAutospacing="1" w:after="100" w:afterAutospacing="1" w:line="240" w:lineRule="auto"/>
+        <w:rPr>
+          <w:rFonts w:ascii="Times New Roman" w:eastAsia="Times New Roman" w:hAnsi="Times New Roman" w:cs="Times New Roman"/>
+          <w:kern w:val="0"/>
+          <w:lang w:eastAsia="it-IT"/>
+          <w14:ligatures w14:val="none"/>
+        </w:rPr>
+      </w:pPr>
+      <w:r>
+        <w:rPr>
+          <w:rFonts w:ascii="Times New Roman" w:eastAsia="Times New Roman" w:hAnsi="Times New Roman" w:cs="Times New Roman"/>
+          <w:i/>
+          <w:iCs/>
+          <w:kern w:val="0"/>
+          <w:lang w:eastAsia="it-IT"/>
+          <w14:ligatures w14:val="none"/>
+        </w:rPr>
+        <w:t>"L'analisi statica sul markup HTML lato client (</w:t>
+      </w:r>
+      <w:proofErr w:type="spellStart"/>
+      <w:r>
+        <w:rPr>
+          <w:rFonts w:ascii="Times New Roman" w:eastAsia="Times New Roman" w:hAnsi="Times New Roman" w:cs="Times New Roman"/>
+          <w:i/>
+          <w:iCs/>
+          <w:kern w:val="0"/>
+          <w:lang w:eastAsia="it-IT"/>
+          <w14:ligatures w14:val="none"/>
+        </w:rPr>
+        <w:t>htmlhint</w:t>
+      </w:r>
+      <w:proofErr w:type="spellEnd"/>
+      <w:r>
+        <w:rPr>
+          <w:rFonts w:ascii="Times New Roman" w:eastAsia="Times New Roman" w:hAnsi="Times New Roman" w:cs="Times New Roman"/>
+          <w:i/>
+          <w:iCs/>
+          <w:kern w:val="0"/>
+          <w:lang w:eastAsia="it-IT"/>
+          <w14:ligatures w14:val="none"/>
+        </w:rPr>
+        <w:t xml:space="preserve">) non ha rilevato problemi strutturali su nessuna delle due interfacce, incluse le regole di unicità degli identificatori DOM — rilevante perché gli stessi identificatori sono usati come selettori nei test </w:t>
+      </w:r>
+      <w:proofErr w:type="spellStart"/>
+      <w:r>
+        <w:rPr>
+          <w:rFonts w:ascii="Times New Roman" w:eastAsia="Times New Roman" w:hAnsi="Times New Roman" w:cs="Times New Roman"/>
+          <w:i/>
+          <w:iCs/>
+          <w:kern w:val="0"/>
+          <w:lang w:eastAsia="it-IT"/>
+          <w14:ligatures w14:val="none"/>
+        </w:rPr>
+        <w:t>Selenium</w:t>
+      </w:r>
+      <w:proofErr w:type="spellEnd"/>
+      <w:r>
+        <w:rPr>
+          <w:rFonts w:ascii="Times New Roman" w:eastAsia="Times New Roman" w:hAnsi="Times New Roman" w:cs="Times New Roman"/>
+          <w:i/>
+          <w:iCs/>
+          <w:kern w:val="0"/>
+          <w:lang w:eastAsia="it-IT"/>
+          <w14:ligatures w14:val="none"/>
+        </w:rPr>
+        <w:t>."</w:t>
+      </w:r>
+    </w:p>
+    <w:p>
+      <w:pPr>
+        <w:rPr>
+          <w:lang w:val="en-US"/>
+        </w:rPr>
+      </w:pPr>
+      <w:r>
+        <w:br/>
+      </w:r>
+      <w:r>
+        <w:rPr>
+          <w:lang w:val="en-US"/>
+        </w:rPr>
+        <w:drawing>
+          <wp:inline distT="0" distB="0" distL="0" distR="0" wp14:anchorId="5A8603A1" wp14:editId="7F29A1FC">
+            <wp:extent cx="6120130" cy="1908810"/>
+            <wp:effectExtent l="0" t="0" r="1270" b="0"/>
+            <wp:docPr id="239485489" name="Immagine 1"/>
+            <wp:cNvGraphicFramePr>
+              <a:graphicFrameLocks xmlns:a="http://schemas.openxmlformats.org/drawingml/2006/main" noChangeAspect="1"/>
+            </wp:cNvGraphicFramePr>
+            <a:graphic xmlns:a="http://schemas.openxmlformats.org/drawingml/2006/main">
+              <a:graphicData uri="http://schemas.openxmlformats.org/drawingml/2006/picture">
+                <pic:pic xmlns:pic="http://schemas.openxmlformats.org/drawingml/2006/picture">
+                  <pic:nvPicPr>
+                    <pic:cNvPr id="239485489" name=""/>
+                    <pic:cNvPicPr/>
+                  </pic:nvPicPr>
+                  <pic:blipFill>
+                    <a:blip r:embed="rId12"/>
+                    <a:stretch>
+                      <a:fillRect/>
+                    </a:stretch>
+                  </pic:blipFill>
+                  <pic:spPr>
+                    <a:xfrm>
+                      <a:off x="0" y="0"/>
+                      <a:ext cx="6120130" cy="1908810"/>
                     </a:xfrm>
                     <a:prstGeom prst="rect">
                       <a:avLst/>
@@ -850,7 +1323,6 @@
     <w:next w:val="Normale"/>
     <w:link w:val="Titolo3Carattere"/>
     <w:uiPriority w:val="9"/>
-    <w:semiHidden/>
     <w:unhideWhenUsed/>
     <w:qFormat/>
     <w:rsid w:val="00FA6D06"/>
@@ -1058,7 +1530,6 @@
     <w:basedOn w:val="Carpredefinitoparagrafo"/>
     <w:link w:val="Titolo3"/>
     <w:uiPriority w:val="9"/>
-    <w:semiHidden/>
     <w:rsid w:val="00FA6D06"/>
     <w:rPr>
       <w:rFonts w:eastAsiaTheme="majorEastAsia" w:cstheme="majorBidi"/>
@@ -1338,6 +1809,31 @@
       <w:rFonts w:ascii="Courier New" w:eastAsia="Times New Roman" w:hAnsi="Courier New" w:cs="Courier New"/>
       <w:sz w:val="20"/>
       <w:szCs w:val="20"/>
+    </w:rPr>
+  </w:style>
+  <w:style w:type="paragraph" w:customStyle="1" w:styleId="font-claude-response-body">
+    <w:name w:val="font-claude-response-body"/>
+    <w:basedOn w:val="Normale"/>
+    <w:rsid w:val="006349B4"/>
+    <w:pPr>
+      <w:spacing w:before="100" w:beforeAutospacing="1" w:after="100" w:afterAutospacing="1" w:line="240" w:lineRule="auto"/>
+    </w:pPr>
+    <w:rPr>
+      <w:rFonts w:ascii="Times New Roman" w:eastAsia="Times New Roman" w:hAnsi="Times New Roman" w:cs="Times New Roman"/>
+      <w:kern w:val="0"/>
+      <w:lang w:eastAsia="it-IT"/>
+      <w14:ligatures w14:val="none"/>
+    </w:rPr>
+  </w:style>
+  <w:style w:type="character" w:styleId="Enfasicorsivo">
+    <w:name w:val="Emphasis"/>
+    <w:basedOn w:val="Carpredefinitoparagrafo"/>
+    <w:uiPriority w:val="20"/>
+    <w:qFormat/>
+    <w:rsid w:val="006349B4"/>
+    <w:rPr>
+      <w:i/>
+      <w:iCs/>
     </w:rPr>
   </w:style>
 </w:styles>

</xml_diff>